<commit_message>
Sync 7,000 m^3 WB-volume cleanup from working repo
Four analysis scripts had hard-coded 7,000 m^3 as the WB observed value
(carried over from pre-LiDAR drafts). Updated to the LiDAR-derived
27,065 m^3 per-mound value, re-ran each, and propagated the resulting
small numerical shifts through the manuscript and supplemental.

See clipo/poverty-point-signaling@858289d for the full per-change log
including the precise old-vs-new numerical values and the rationale
for removing all historical references to the 7,000 m^3 figure (the
user-direction was that it was simply wrong and shouldn't be
referenced even as historical context).
</commit_message>
<xml_diff>
--- a/docs/jamt/Supplemental.docx
+++ b/docs/jamt/Supplemental.docx
@@ -25500,7 +25500,7 @@
                 <m:t>+</m:t>
               </m:r>
               <m:r>
-                <m:t>0.014</m:t>
+                <m:t>0.03</m:t>
               </m:r>
             </m:oMath>
           </w:p>
@@ -30644,7 +30644,65 @@
         </m:r>
       </m:oMath>
       <w:r>
-        <w:t xml:space="preserve">. The earlier 7,000 m³ figure used in pre-LiDAR drafts of the manuscript (which gave the often-cited ~30× ratio) was an under-estimate; the LiDAR re-analysis (§5.1;</w:t>
+        <w:t xml:space="preserve">. The same continuous-equilibrium calculation propagated through the</w:t>
+      </w:r>
+      <w:r>
+        <w:t xml:space="preserve"> </w:t>
+      </w:r>
+      <m:oMath>
+        <m:sSub>
+          <m:e>
+            <m:r>
+              <m:t>n</m:t>
+            </m:r>
+          </m:e>
+          <m:sub>
+            <m:r>
+              <m:t>a</m:t>
+            </m:r>
+            <m:r>
+              <m:t>g</m:t>
+            </m:r>
+            <m:r>
+              <m:t>g</m:t>
+            </m:r>
+          </m:sub>
+        </m:sSub>
+      </m:oMath>
+      <w:r>
+        <w:t xml:space="preserve"> </w:t>
+      </w:r>
+      <w:r>
+        <w:t xml:space="preserve">sensitivity sweep below confirms that no plausible</w:t>
+      </w:r>
+      <w:r>
+        <w:t xml:space="preserve"> </w:t>
+      </w:r>
+      <m:oMath>
+        <m:sSub>
+          <m:e>
+            <m:r>
+              <m:t>n</m:t>
+            </m:r>
+          </m:e>
+          <m:sub>
+            <m:r>
+              <m:t>a</m:t>
+            </m:r>
+            <m:r>
+              <m:t>g</m:t>
+            </m:r>
+            <m:r>
+              <m:t>g</m:t>
+            </m:r>
+          </m:sub>
+        </m:sSub>
+      </m:oMath>
+      <w:r>
+        <w:t xml:space="preserve"> </w:t>
+      </w:r>
+      <w:r>
+        <w:t xml:space="preserve">value closes the 9× gap. Methodology and per-cluster breakdown for the 27,065 m³ figure are in §5.1; the analysis script is</w:t>
       </w:r>
       <w:r>
         <w:t xml:space="preserve"> </w:t>
@@ -30656,65 +30714,7 @@
         <w:t xml:space="preserve">scripts/analysis/watson_brake_volume.py</w:t>
       </w:r>
       <w:r>
-        <w:t xml:space="preserve">) replaces it. An intermediate LiDAR baseline-method sensitivity range of 15,000-120,000 m³ (the seven polygon-wide baselines in the analysis script) is documented in the JSON output for transparency, but the per-mound estimate of 27,065 m³ is the authoritative central value because it uses local rather than polygon-wide baselines and treats the mounds and ridges as resting on natural ground rather than on a constructed inter-mound surface. The same continuous-equilibrium calculation propagated through the</w:t>
-      </w:r>
-      <w:r>
-        <w:t xml:space="preserve"> </w:t>
-      </w:r>
-      <m:oMath>
-        <m:sSub>
-          <m:e>
-            <m:r>
-              <m:t>n</m:t>
-            </m:r>
-          </m:e>
-          <m:sub>
-            <m:r>
-              <m:t>a</m:t>
-            </m:r>
-            <m:r>
-              <m:t>g</m:t>
-            </m:r>
-            <m:r>
-              <m:t>g</m:t>
-            </m:r>
-          </m:sub>
-        </m:sSub>
-      </m:oMath>
-      <w:r>
-        <w:t xml:space="preserve"> </w:t>
-      </w:r>
-      <w:r>
-        <w:t xml:space="preserve">sensitivity sweep below confirms that no plausible</w:t>
-      </w:r>
-      <w:r>
-        <w:t xml:space="preserve"> </w:t>
-      </w:r>
-      <m:oMath>
-        <m:sSub>
-          <m:e>
-            <m:r>
-              <m:t>n</m:t>
-            </m:r>
-          </m:e>
-          <m:sub>
-            <m:r>
-              <m:t>a</m:t>
-            </m:r>
-            <m:r>
-              <m:t>g</m:t>
-            </m:r>
-            <m:r>
-              <m:t>g</m:t>
-            </m:r>
-          </m:sub>
-        </m:sSub>
-      </m:oMath>
-      <w:r>
-        <w:t xml:space="preserve"> </w:t>
-      </w:r>
-      <w:r>
-        <w:t xml:space="preserve">value closes the 9× gap.</w:t>
+        <w:t xml:space="preserve">.</w:t>
       </w:r>
     </w:p>
     <w:p>
@@ -31735,7 +31735,7 @@
         <w:t xml:space="preserve"> </w:t>
       </w:r>
       <w:r>
-        <w:t xml:space="preserve">(§S17.2) produces ~25,000 m³ of cumulative investment, essentially matching the observed value within ~7%. Closing the gap therefore primarily requires the per-event labor-scaling extension; the bistable regime-switching mechanism contributes the episodic</w:t>
+        <w:t xml:space="preserve">(§S17.2) produces ~25,000 m³ of cumulative investment, essentially matching the observed value within ~9%. Closing the gap therefore primarily requires the per-event labor-scaling extension; the bistable regime-switching mechanism contributes the episodic</w:t>
       </w:r>
       <w:r>
         <w:t xml:space="preserve"> </w:t>
@@ -37592,35 +37592,18 @@
         <w:pStyle w:val="BodyText"/>
       </w:pPr>
       <w:r>
-        <w:t xml:space="preserve">Under the prior 7,000 m³ WB volume figure,</w:t>
-      </w:r>
-      <w:r>
-        <w:t xml:space="preserve"> </w:t>
-      </w:r>
-      <m:oMath>
-        <m:r>
-          <m:t>K</m:t>
-        </m:r>
-        <m:r>
-          <m:rPr>
-            <m:sty m:val="p"/>
-          </m:rPr>
-          <m:t>=</m:t>
-        </m:r>
-        <m:r>
-          <m:t>3</m:t>
-        </m:r>
-      </m:oMath>
-      <w:r>
-        <w:t xml:space="preserve"> </w:t>
-      </w:r>
-      <w:r>
-        <w:t xml:space="preserve">years and</w:t>
-      </w:r>
-      <w:r>
-        <w:t xml:space="preserve"> </w:t>
-      </w:r>
-      <m:oMath>
+        <w:t xml:space="preserve">Across the swept</w:t>
+      </w:r>
+      <w:r>
+        <w:t xml:space="preserve"> </w:t>
+      </w:r>
+      <m:oMath>
+        <m:r>
+          <m:rPr>
+            <m:sty m:val="p"/>
+          </m:rPr>
+          <m:t>(</m:t>
+        </m:r>
         <m:sSub>
           <m:e>
             <m:r>
@@ -37640,28 +37623,81 @@
           <m:rPr>
             <m:sty m:val="p"/>
           </m:rPr>
-          <m:t>≈</m:t>
-        </m:r>
-        <m:r>
-          <m:t>0.10</m:t>
-        </m:r>
-      </m:oMath>
-      <w:r>
-        <w:t xml:space="preserve"> </w:t>
-      </w:r>
-      <w:r>
-        <w:t xml:space="preserve">gave a sweep-selected closure (predicted 5,408 m³ inside the prior observed value’s 95% CI). Under the refined LiDAR-derived per-mound WB volume of 27,065 m³ (§5.1), the role of regime switching shifts. Across the swept</w:t>
-      </w:r>
-      <w:r>
-        <w:t xml:space="preserve"> </w:t>
-      </w:r>
-      <m:oMath>
-        <m:r>
-          <m:rPr>
-            <m:sty m:val="p"/>
-          </m:rPr>
-          <m:t>(</m:t>
-        </m:r>
+          <m:t>,</m:t>
+        </m:r>
+        <m:r>
+          <m:t>K</m:t>
+        </m:r>
+        <m:r>
+          <m:rPr>
+            <m:sty m:val="p"/>
+          </m:rPr>
+          <m:t>)</m:t>
+        </m:r>
+      </m:oMath>
+      <w:r>
+        <w:t xml:space="preserve"> </w:t>
+      </w:r>
+      <w:r>
+        <w:t xml:space="preserve">grid at the LiDAR-derived per-mound WB volume of 27,065 m³ (§5.1), regime-switching predictions for cumulative WB volume span ~2,800 to ~89,000 m³ at</w:t>
+      </w:r>
+      <w:r>
+        <w:t xml:space="preserve"> </w:t>
+      </w:r>
+      <m:oMath>
+        <m:r>
+          <m:t>K</m:t>
+        </m:r>
+        <m:r>
+          <m:rPr>
+            <m:sty m:val="p"/>
+          </m:rPr>
+          <m:t>∈</m:t>
+        </m:r>
+        <m:r>
+          <m:rPr>
+            <m:sty m:val="p"/>
+          </m:rPr>
+          <m:t>{</m:t>
+        </m:r>
+        <m:r>
+          <m:t>1</m:t>
+        </m:r>
+        <m:r>
+          <m:rPr>
+            <m:sty m:val="p"/>
+          </m:rPr>
+          <m:t>,</m:t>
+        </m:r>
+        <m:r>
+          <m:t>2</m:t>
+        </m:r>
+        <m:r>
+          <m:rPr>
+            <m:sty m:val="p"/>
+          </m:rPr>
+          <m:t>,</m:t>
+        </m:r>
+        <m:r>
+          <m:t>3</m:t>
+        </m:r>
+        <m:r>
+          <m:rPr>
+            <m:sty m:val="p"/>
+          </m:rPr>
+          <m:t>}</m:t>
+        </m:r>
+      </m:oMath>
+      <w:r>
+        <w:t xml:space="preserve"> </w:t>
+      </w:r>
+      <w:r>
+        <w:t xml:space="preserve">and</w:t>
+      </w:r>
+      <w:r>
+        <w:t xml:space="preserve"> </w:t>
+      </w:r>
+      <m:oMath>
         <m:sSub>
           <m:e>
             <m:r>
@@ -37681,76 +37717,35 @@
           <m:rPr>
             <m:sty m:val="p"/>
           </m:rPr>
+          <m:t>∈</m:t>
+        </m:r>
+        <m:r>
+          <m:rPr>
+            <m:sty m:val="p"/>
+          </m:rPr>
+          <m:t>[</m:t>
+        </m:r>
+        <m:r>
+          <m:t>0.075</m:t>
+        </m:r>
+        <m:r>
+          <m:rPr>
+            <m:sty m:val="p"/>
+          </m:rPr>
           <m:t>,</m:t>
         </m:r>
         <m:r>
-          <m:t>K</m:t>
-        </m:r>
-        <m:r>
-          <m:rPr>
-            <m:sty m:val="p"/>
-          </m:rPr>
-          <m:t>)</m:t>
-        </m:r>
-      </m:oMath>
-      <w:r>
-        <w:t xml:space="preserve"> </w:t>
-      </w:r>
-      <w:r>
-        <w:t xml:space="preserve">grid, regime-switching predictions for cumulative WB volume span ~5,000 to ~54,000 m³ at</w:t>
-      </w:r>
-      <w:r>
-        <w:t xml:space="preserve"> </w:t>
-      </w:r>
-      <m:oMath>
-        <m:r>
-          <m:t>K</m:t>
-        </m:r>
-        <m:r>
-          <m:rPr>
-            <m:sty m:val="p"/>
-          </m:rPr>
-          <m:t>∈</m:t>
-        </m:r>
-        <m:r>
-          <m:rPr>
-            <m:sty m:val="p"/>
-          </m:rPr>
-          <m:t>{</m:t>
-        </m:r>
-        <m:r>
-          <m:t>1</m:t>
-        </m:r>
-        <m:r>
-          <m:rPr>
-            <m:sty m:val="p"/>
-          </m:rPr>
-          <m:t>,</m:t>
-        </m:r>
-        <m:r>
-          <m:t>2</m:t>
-        </m:r>
-        <m:r>
-          <m:rPr>
-            <m:sty m:val="p"/>
-          </m:rPr>
-          <m:t>,</m:t>
-        </m:r>
-        <m:r>
-          <m:t>3</m:t>
-        </m:r>
-        <m:r>
-          <m:rPr>
-            <m:sty m:val="p"/>
-          </m:rPr>
-          <m:t>}</m:t>
-        </m:r>
-      </m:oMath>
-      <w:r>
-        <w:t xml:space="preserve"> </w:t>
-      </w:r>
-      <w:r>
-        <w:t xml:space="preserve">and</w:t>
+          <m:t>0.20</m:t>
+        </m:r>
+        <m:r>
+          <m:rPr>
+            <m:sty m:val="p"/>
+          </m:rPr>
+          <m:t>]</m:t>
+        </m:r>
+      </m:oMath>
+      <w:r>
+        <w:t xml:space="preserve">. The observed 27,065 m³ sits inside the K=2 sweep range (~12,000 to ~35,000 m³ across this</w:t>
       </w:r>
       <w:r>
         <w:t xml:space="preserve"> </w:t>
@@ -37771,108 +37766,12 @@
             </m:r>
           </m:sub>
         </m:sSub>
-        <m:r>
-          <m:rPr>
-            <m:sty m:val="p"/>
-          </m:rPr>
-          <m:t>∈</m:t>
-        </m:r>
-        <m:r>
-          <m:rPr>
-            <m:sty m:val="p"/>
-          </m:rPr>
-          <m:t>[</m:t>
-        </m:r>
-        <m:r>
-          <m:t>0.075</m:t>
-        </m:r>
-        <m:r>
-          <m:rPr>
-            <m:sty m:val="p"/>
-          </m:rPr>
-          <m:t>,</m:t>
-        </m:r>
-        <m:r>
-          <m:t>0.20</m:t>
-        </m:r>
-        <m:r>
-          <m:rPr>
-            <m:sty m:val="p"/>
-          </m:rPr>
-          <m:t>]</m:t>
-        </m:r>
-      </m:oMath>
-      <w:r>
-        <w:t xml:space="preserve">. The observed 27,065 m³ sits between the</w:t>
-      </w:r>
-      <w:r>
-        <w:t xml:space="preserve"> </w:t>
-      </w:r>
-      <m:oMath>
-        <m:r>
-          <m:t>K</m:t>
-        </m:r>
-        <m:r>
-          <m:rPr>
-            <m:sty m:val="p"/>
-          </m:rPr>
-          <m:t>=</m:t>
-        </m:r>
-        <m:r>
-          <m:t>3</m:t>
-        </m:r>
-      </m:oMath>
-      <w:r>
-        <w:t xml:space="preserve"> </w:t>
-      </w:r>
-      <w:r>
-        <w:t xml:space="preserve">undershoot (~5,000 m³) and the</w:t>
-      </w:r>
-      <w:r>
-        <w:t xml:space="preserve"> </w:t>
-      </w:r>
-      <m:oMath>
-        <m:r>
-          <m:t>K</m:t>
-        </m:r>
-        <m:r>
-          <m:rPr>
-            <m:sty m:val="p"/>
-          </m:rPr>
-          <m:t>=</m:t>
-        </m:r>
-        <m:r>
-          <m:t>1</m:t>
-        </m:r>
-      </m:oMath>
-      <w:r>
-        <w:t xml:space="preserve"> </w:t>
-      </w:r>
-      <w:r>
-        <w:t xml:space="preserve">overshoot (~54,000 m³) and would be bracketed by an intermediate</w:t>
-      </w:r>
-      <w:r>
-        <w:t xml:space="preserve"> </w:t>
-      </w:r>
-      <m:oMath>
-        <m:r>
-          <m:t>K</m:t>
-        </m:r>
-        <m:r>
-          <m:rPr>
-            <m:sty m:val="p"/>
-          </m:rPr>
-          <m:t>=</m:t>
-        </m:r>
-        <m:r>
-          <m:t>2</m:t>
-        </m:r>
-      </m:oMath>
-      <w:r>
-        <w:t xml:space="preserve"> </w:t>
-      </w:r>
-      <w:r>
-        <w:t xml:space="preserve">value. The per-event labor-scaling extension (§S17.2) closes the WB gap essentially exactly (~25,000 m³ predicted, 0.93× of observed) independently of any specific</w:t>
+      </m:oMath>
+      <w:r>
+        <w:t xml:space="preserve"> </w:t>
+      </w:r>
+      <w:r>
+        <w:t xml:space="preserve">range), with K=1 overshooting (~52,000 to ~89,000 m³) and K=3 undershooting (~2,800 to ~13,600 m³). The per-event labor-scaling extension (§S17.2) closes the WB gap essentially exactly (~25,000 m³ predicted, 0.91× of observed) independently of any specific</w:t>
       </w:r>
       <w:r>
         <w:t xml:space="preserve"> </w:t>
@@ -38439,7 +38338,7 @@
           <m:t>+</m:t>
         </m:r>
         <m:r>
-          <m:t>0.15</m:t>
+          <m:t>0.10</m:t>
         </m:r>
       </m:oMath>
       <w:r>
@@ -38480,7 +38379,7 @@
         <w:t xml:space="preserve"> </w:t>
       </w:r>
       <w:r>
-        <w:t xml:space="preserve">of observed volume). At</w:t>
+        <w:t xml:space="preserve">of observed volume; std of log-ratios is 0.54). At</w:t>
       </w:r>
       <w:r>
         <w:t xml:space="preserve"> </w:t>
@@ -38500,7 +38399,7 @@
         </m:r>
       </m:oMath>
       <w:r>
-        <w:t xml:space="preserve">, the WB prediction drops from 240,000 m³ to ~25,000 m³, essentially matching the LiDAR-derived per-mound volume of 27,065 m³ (§5.1) within ~7% (ratio 0.93×). Under the prior 7,000 m³ figure this prediction read as a ~3.5× overshoot; under the refined per-mound estimate the prediction is a near-exact match. J.W. Copes drops from 90,000 m³ to ~1,300 m³ (vs observed 500 m³, ~2.6</w:t>
+        <w:t xml:space="preserve">, the WB prediction drops from 240,000 m³ to ~25,000 m³, essentially matching the LiDAR-derived per-mound volume of 27,065 m³ (§5.1) within ~9% (ratio 0.91×). J.W. Copes drops from 90,000 m³ to ~1,300 m³ (vs observed 500 m³, ~2.6</w:t>
       </w:r>
       <m:oMath>
         <m:r>
@@ -41655,7 +41554,7 @@
           <m:t>+</m:t>
         </m:r>
         <m:r>
-          <m:t>0.89</m:t>
+          <m:t>0.91</m:t>
         </m:r>
       </m:oMath>
       <w:r>
@@ -41741,7 +41640,7 @@
         </m:r>
       </m:oMath>
       <w:r>
-        <w:t xml:space="preserve">) is:</w:t>
+        <w:t xml:space="preserve">), against ordinal scale, is:</w:t>
       </w:r>
       <w:r>
         <w:t xml:space="preserve"> </w:t>
@@ -41754,7 +41653,7 @@
           <m:t>−</m:t>
         </m:r>
         <m:r>
-          <m:t>0.009</m:t>
+          <m:t>0.019</m:t>
         </m:r>
       </m:oMath>
       <w:r>
@@ -41774,7 +41673,7 @@
           <m:t>+</m:t>
         </m:r>
         <m:r>
-          <m:t>0.005</m:t>
+          <m:t>0.015</m:t>
         </m:r>
       </m:oMath>
       <w:r>
@@ -41794,7 +41693,7 @@
           <m:t>+</m:t>
         </m:r>
         <m:r>
-          <m:t>0.014</m:t>
+          <m:t>0.029</m:t>
         </m:r>
       </m:oMath>
       <w:r>

</xml_diff>

<commit_message>
Update S7.0 status-table rows (6.1 exotic, 6.6) to revised results; rebuild Supplemental.docx
</commit_message>
<xml_diff>
--- a/docs/jamt/Supplemental.docx
+++ b/docs/jamt/Supplemental.docx
@@ -33416,7 +33416,7 @@
               <w:pStyle w:val="Compact"/>
             </w:pPr>
             <w:r>
-              <w:t xml:space="preserve">Partial test; consistent for copper (after recovery), for galena (after recovery), vessel-basis for steatite</w:t>
+              <w:t xml:space="preserve">Partial test; consistent for copper and galena in like units and for steatite on a vessel basis; near-source materials (novaculite, crystal quartz) overpredicted 8-63× by the cost-driven acquisition rule (genuine misfit); joint Mahalanobis rejects</w:t>
             </w:r>
           </w:p>
         </w:tc>
@@ -34100,7 +34100,7 @@
                 <m:t>+</m:t>
               </m:r>
               <m:r>
-                <m:t>0.91</m:t>
+                <m:t>0.92</m:t>
               </m:r>
             </m:oMath>
             <w:r>
@@ -34118,7 +34118,7 @@
               <w:t xml:space="preserve"> </w:t>
             </w:r>
             <w:r>
-              <w:t xml:space="preserve">contributes</w:t>
+              <w:t xml:space="preserve">contributes at most</w:t>
             </w:r>
             <w:r>
               <w:t xml:space="preserve"> </w:t>
@@ -34128,16 +34128,10 @@
                 <m:rPr>
                   <m:sty m:val="p"/>
                 </m:rPr>
-                <m:t>≤</m:t>
-              </m:r>
-              <m:r>
-                <m:rPr>
-                  <m:sty m:val="p"/>
-                </m:rPr>
-                <m:t>+</m:t>
-              </m:r>
-              <m:r>
-                <m:t>0.03</m:t>
+                <m:t>±</m:t>
+              </m:r>
+              <m:r>
+                <m:t>0.02</m:t>
               </m:r>
             </m:oMath>
           </w:p>

</xml_diff>